<commit_message>
Restructure dashboard individual and batch upload panels, build payment gateway checkout overlays and support chatbot widget, add profile page, and update all functional and non-functional test plans
</commit_message>
<xml_diff>
--- a/docs/Compatibility_Test_Plan.docx
+++ b/docs/Compatibility_Test_Plan.docx
@@ -877,6 +877,230 @@
           </w:p>
         </w:tc>
       </w:tr>
+      <w:tr>
+        <w:tc>
+          <w:tcPr>
+            <w:tcW w:type="dxa" w:w="1872"/>
+            <w:shd w:fill="F9FAFB"/>
+            <w:tcMar>
+              <w:top w:w="100" w:type="dxa"/>
+              <w:bottom w:w="100" w:type="dxa"/>
+              <w:left w:w="150" w:type="dxa"/>
+              <w:right w:w="150" w:type="dxa"/>
+            </w:tcMar>
+          </w:tcPr>
+          <w:p>
+            <w:r>
+              <w:rPr>
+                <w:rFonts w:ascii="Segoe UI" w:hAnsi="Segoe UI"/>
+                <w:color w:val="374151"/>
+                <w:sz w:val="18"/>
+              </w:rPr>
+              <w:t>**TC-COMP-06**</w:t>
+            </w:r>
+          </w:p>
+        </w:tc>
+        <w:tc>
+          <w:tcPr>
+            <w:tcW w:type="dxa" w:w="1872"/>
+            <w:shd w:fill="F9FAFB"/>
+            <w:tcMar>
+              <w:top w:w="100" w:type="dxa"/>
+              <w:bottom w:w="100" w:type="dxa"/>
+              <w:left w:w="150" w:type="dxa"/>
+              <w:right w:w="150" w:type="dxa"/>
+            </w:tcMar>
+          </w:tcPr>
+          <w:p>
+            <w:r>
+              <w:rPr>
+                <w:rFonts w:ascii="Segoe UI" w:hAnsi="Segoe UI"/>
+                <w:color w:val="374151"/>
+                <w:sz w:val="18"/>
+              </w:rPr>
+              <w:t>Chatbot Bubble Z-Index</w:t>
+            </w:r>
+          </w:p>
+        </w:tc>
+        <w:tc>
+          <w:tcPr>
+            <w:tcW w:type="dxa" w:w="1872"/>
+            <w:shd w:fill="F9FAFB"/>
+            <w:tcMar>
+              <w:top w:w="100" w:type="dxa"/>
+              <w:bottom w:w="100" w:type="dxa"/>
+              <w:left w:w="150" w:type="dxa"/>
+              <w:right w:w="150" w:type="dxa"/>
+            </w:tcMar>
+          </w:tcPr>
+          <w:p>
+            <w:r>
+              <w:rPr>
+                <w:rFonts w:ascii="Segoe UI" w:hAnsi="Segoe UI"/>
+                <w:color w:val="374151"/>
+                <w:sz w:val="18"/>
+              </w:rPr>
+              <w:t>Scroll the page and check floating chat bubble positioning.</w:t>
+            </w:r>
+          </w:p>
+        </w:tc>
+        <w:tc>
+          <w:tcPr>
+            <w:tcW w:type="dxa" w:w="1872"/>
+            <w:shd w:fill="F9FAFB"/>
+            <w:tcMar>
+              <w:top w:w="100" w:type="dxa"/>
+              <w:bottom w:w="100" w:type="dxa"/>
+              <w:left w:w="150" w:type="dxa"/>
+              <w:right w:w="150" w:type="dxa"/>
+            </w:tcMar>
+          </w:tcPr>
+          <w:p>
+            <w:r>
+              <w:rPr>
+                <w:rFonts w:ascii="Segoe UI" w:hAnsi="Segoe UI"/>
+                <w:color w:val="374151"/>
+                <w:sz w:val="18"/>
+              </w:rPr>
+              <w:t>The chat bubble stays fixed at the bottom-right and layers above all cards/tables (`z-index: 4000`).</w:t>
+            </w:r>
+          </w:p>
+        </w:tc>
+        <w:tc>
+          <w:tcPr>
+            <w:tcW w:type="dxa" w:w="1872"/>
+            <w:shd w:fill="F9FAFB"/>
+            <w:tcMar>
+              <w:top w:w="100" w:type="dxa"/>
+              <w:bottom w:w="100" w:type="dxa"/>
+              <w:left w:w="150" w:type="dxa"/>
+              <w:right w:w="150" w:type="dxa"/>
+            </w:tcMar>
+          </w:tcPr>
+          <w:p>
+            <w:r>
+              <w:rPr>
+                <w:rFonts w:ascii="Segoe UI" w:hAnsi="Segoe UI"/>
+                <w:color w:val="374151"/>
+                <w:sz w:val="18"/>
+              </w:rPr>
+              <w:t>Pending</w:t>
+            </w:r>
+          </w:p>
+        </w:tc>
+      </w:tr>
+      <w:tr>
+        <w:tc>
+          <w:tcPr>
+            <w:tcW w:type="dxa" w:w="1872"/>
+            <w:shd w:fill="FFFFFF"/>
+            <w:tcMar>
+              <w:top w:w="100" w:type="dxa"/>
+              <w:bottom w:w="100" w:type="dxa"/>
+              <w:left w:w="150" w:type="dxa"/>
+              <w:right w:w="150" w:type="dxa"/>
+            </w:tcMar>
+          </w:tcPr>
+          <w:p>
+            <w:r>
+              <w:rPr>
+                <w:rFonts w:ascii="Segoe UI" w:hAnsi="Segoe UI"/>
+                <w:color w:val="374151"/>
+                <w:sz w:val="18"/>
+              </w:rPr>
+              <w:t>**TC-COMP-07**</w:t>
+            </w:r>
+          </w:p>
+        </w:tc>
+        <w:tc>
+          <w:tcPr>
+            <w:tcW w:type="dxa" w:w="1872"/>
+            <w:shd w:fill="FFFFFF"/>
+            <w:tcMar>
+              <w:top w:w="100" w:type="dxa"/>
+              <w:bottom w:w="100" w:type="dxa"/>
+              <w:left w:w="150" w:type="dxa"/>
+              <w:right w:w="150" w:type="dxa"/>
+            </w:tcMar>
+          </w:tcPr>
+          <w:p>
+            <w:r>
+              <w:rPr>
+                <w:rFonts w:ascii="Segoe UI" w:hAnsi="Segoe UI"/>
+                <w:color w:val="374151"/>
+                <w:sz w:val="18"/>
+              </w:rPr>
+              <w:t>PromptPay SVG Rendering</w:t>
+            </w:r>
+          </w:p>
+        </w:tc>
+        <w:tc>
+          <w:tcPr>
+            <w:tcW w:type="dxa" w:w="1872"/>
+            <w:shd w:fill="FFFFFF"/>
+            <w:tcMar>
+              <w:top w:w="100" w:type="dxa"/>
+              <w:bottom w:w="100" w:type="dxa"/>
+              <w:left w:w="150" w:type="dxa"/>
+              <w:right w:w="150" w:type="dxa"/>
+            </w:tcMar>
+          </w:tcPr>
+          <w:p>
+            <w:r>
+              <w:rPr>
+                <w:rFonts w:ascii="Segoe UI" w:hAnsi="Segoe UI"/>
+                <w:color w:val="374151"/>
+                <w:sz w:val="18"/>
+              </w:rPr>
+              <w:t>Inspect checkout PromptPay QR code on Firefox, Safari, and Chrome.</w:t>
+            </w:r>
+          </w:p>
+        </w:tc>
+        <w:tc>
+          <w:tcPr>
+            <w:tcW w:type="dxa" w:w="1872"/>
+            <w:shd w:fill="FFFFFF"/>
+            <w:tcMar>
+              <w:top w:w="100" w:type="dxa"/>
+              <w:bottom w:w="100" w:type="dxa"/>
+              <w:left w:w="150" w:type="dxa"/>
+              <w:right w:w="150" w:type="dxa"/>
+            </w:tcMar>
+          </w:tcPr>
+          <w:p>
+            <w:r>
+              <w:rPr>
+                <w:rFonts w:ascii="Segoe UI" w:hAnsi="Segoe UI"/>
+                <w:color w:val="374151"/>
+                <w:sz w:val="18"/>
+              </w:rPr>
+              <w:t>SVG vector scales dynamically and preserves high-contrast lines for physical scanning.</w:t>
+            </w:r>
+          </w:p>
+        </w:tc>
+        <w:tc>
+          <w:tcPr>
+            <w:tcW w:type="dxa" w:w="1872"/>
+            <w:shd w:fill="FFFFFF"/>
+            <w:tcMar>
+              <w:top w:w="100" w:type="dxa"/>
+              <w:bottom w:w="100" w:type="dxa"/>
+              <w:left w:w="150" w:type="dxa"/>
+              <w:right w:w="150" w:type="dxa"/>
+            </w:tcMar>
+          </w:tcPr>
+          <w:p>
+            <w:r>
+              <w:rPr>
+                <w:rFonts w:ascii="Segoe UI" w:hAnsi="Segoe UI"/>
+                <w:color w:val="374151"/>
+                <w:sz w:val="18"/>
+              </w:rPr>
+              <w:t>Pending</w:t>
+            </w:r>
+          </w:p>
+        </w:tc>
+      </w:tr>
     </w:tbl>
     <w:p/>
     <w:p>

</xml_diff>